<commit_message>
Module 1 — v6: Canonical metric source precedence
Adds a SOURCE PRECEDENCE rule to the Ledger Sidecar section. When the knowledge base includes the canonical locked-metrics appendix, Module 1 now builds each run's metric sidecar by selecting the relevant entries and copying them verbatim, rather than re-deriving numeric tokens from prose on every run. This closes the last attention-dependent step in the metric chain: token transcription becomes verbatim selection from a verified list. When no canonical appendix is present, behavior is unchanged from v5, except the emitted sidecar is now prefixed with a flag marking it as prose-derived so downstream confidence is explicit. A requested metric that the appendix lacks triggers a stop-and-ask rather than an improvised value, and the missing entry is proposed for the canonical list so the fix persists across future runs.
</commit_message>
<xml_diff>
--- a/resume-optimization-system:/modules:/Module_1_JD_Ingestion.docx
+++ b/resume-optimization-system:/modules:/Module_1_JD_Ingestion.docx
@@ -1,6 +1,6 @@
 
 <file path=word/document.xml><?xml version="1.0" encoding="utf-8"?>
-<w:document xmlns:wpc="http://schemas.microsoft.com/office/word/2010/wordprocessingCanvas" xmlns:cx="http://schemas.microsoft.com/office/drawing/2014/chartex" xmlns:cx1="http://schemas.microsoft.com/office/drawing/2015/9/8/chartex" xmlns:cx2="http://schemas.microsoft.com/office/drawing/2015/10/21/chartex" xmlns:cx3="http://schemas.microsoft.com/office/drawing/2016/5/9/chartex" xmlns:cx4="http://schemas.microsoft.com/office/drawing/2016/5/10/chartex" xmlns:cx5="http://schemas.microsoft.com/office/drawing/2016/5/11/chartex" xmlns:cx6="http://schemas.microsoft.com/office/drawing/2016/5/12/chartex" xmlns:cx7="http://schemas.microsoft.com/office/drawing/2016/5/13/chartex" xmlns:cx8="http://schemas.microsoft.com/office/drawing/2016/5/14/chartex" xmlns:mc="http://schemas.openxmlformats.org/markup-compatibility/2006" xmlns:aink="http://schemas.microsoft.com/office/drawing/2016/ink" xmlns:am3d="http://schemas.microsoft.com/office/drawing/2017/model3d" xmlns:o="urn:schemas-microsoft-com:office:office" xmlns:oel="http://schemas.microsoft.com/office/2019/extlst" xmlns:r="http://schemas.openxmlformats.org/officeDocument/2006/relationships" xmlns:m="http://schemas.openxmlformats.org/officeDocument/2006/math" xmlns:v="urn:schemas-microsoft-com:vml" xmlns:wp14="http://schemas.microsoft.com/office/word/2010/wordprocessingDrawing" xmlns:wp="http://schemas.openxmlformats.org/drawingml/2006/wordprocessingDrawing" xmlns:w10="urn:schemas-microsoft-com:office:word" xmlns:w="http://schemas.openxmlformats.org/wordprocessingml/2006/main" xmlns:w14="http://schemas.microsoft.com/office/word/2010/wordml" xmlns:w15="http://schemas.microsoft.com/office/word/2012/wordml" xmlns:w16cex="http://schemas.microsoft.com/office/word/2018/wordml/cex" xmlns:w16cid="http://schemas.microsoft.com/office/word/2016/wordml/cid" xmlns:w16="http://schemas.microsoft.com/office/word/2018/wordml" xmlns:w16du="http://schemas.microsoft.com/office/word/2023/wordml/word16du" xmlns:w16sdtdh="http://schemas.microsoft.com/office/word/2020/wordml/sdtdatahash" xmlns:w16sdtfl="http://schemas.microsoft.com/office/word/2024/wordml/sdtformatlock" xmlns:w16se="http://schemas.microsoft.com/office/word/2015/wordml/symex" xmlns:wpg="http://schemas.microsoft.com/office/word/2010/wordprocessingGroup" xmlns:wpi="http://schemas.microsoft.com/office/word/2010/wordprocessingInk" xmlns:wne="http://schemas.microsoft.com/office/word/2006/wordml" xmlns:wps="http://schemas.microsoft.com/office/word/2010/wordprocessingShape" mc:Ignorable="w14 w15 w16se w16cid w16 w16cex w16sdtdh w16sdtfl w16du wp14">
+<w:document xmlns:wpc="http://schemas.microsoft.com/office/word/2010/wordprocessingCanvas" xmlns:cx="http://schemas.microsoft.com/office/drawing/2014/chartex" xmlns:cx1="http://schemas.microsoft.com/office/drawing/2015/9/8/chartex" xmlns:cx2="http://schemas.microsoft.com/office/drawing/2015/10/21/chartex" xmlns:cx3="http://schemas.microsoft.com/office/drawing/2016/5/9/chartex" xmlns:cx4="http://schemas.microsoft.com/office/drawing/2016/5/10/chartex" xmlns:cx5="http://schemas.microsoft.com/office/drawing/2016/5/11/chartex" xmlns:cx6="http://schemas.microsoft.com/office/drawing/2016/5/12/chartex" xmlns:cx7="http://schemas.microsoft.com/office/drawing/2016/5/13/chartex" xmlns:cx8="http://schemas.microsoft.com/office/drawing/2016/5/14/chartex" xmlns:mc="http://schemas.openxmlformats.org/markup-compatibility/2006" xmlns:m="http://schemas.openxmlformats.org/officeDocument/2006/math" xmlns:aink="http://schemas.microsoft.com/office/drawing/2016/ink" xmlns:am3d="http://schemas.microsoft.com/office/drawing/2017/model3d" xmlns:oel="http://schemas.microsoft.com/office/2019/extlst" xmlns:r="http://schemas.openxmlformats.org/officeDocument/2006/relationships" xmlns:wp14="http://schemas.microsoft.com/office/word/2010/wordprocessingDrawing" xmlns:wp="http://schemas.openxmlformats.org/drawingml/2006/wordprocessingDrawing" xmlns:wpg="http://schemas.microsoft.com/office/word/2010/wordprocessingGroup" xmlns:wpi="http://schemas.microsoft.com/office/word/2010/wordprocessingInk" xmlns:wps="http://schemas.microsoft.com/office/word/2010/wordprocessingShape" xmlns:o="urn:schemas-microsoft-com:office:office" xmlns:v="urn:schemas-microsoft-com:vml" xmlns:w10="urn:schemas-microsoft-com:office:word" xmlns:w="http://schemas.openxmlformats.org/wordprocessingml/2006/main" xmlns:w14="http://schemas.microsoft.com/office/word/2010/wordml" xmlns:w15="http://schemas.microsoft.com/office/word/2012/wordml" xmlns:w16cex="http://schemas.microsoft.com/office/word/2018/wordml/cex" xmlns:w16cid="http://schemas.microsoft.com/office/word/2016/wordml/cid" xmlns:w16="http://schemas.microsoft.com/office/word/2018/wordml" xmlns:w16sdtdh="http://schemas.microsoft.com/office/word/2020/wordml/sdtdatahash" xmlns:w16sdtfl="http://schemas.microsoft.com/office/word/2024/wordml/sdtformatlock" xmlns:w16se="http://schemas.microsoft.com/office/word/2015/wordml/symex" xmlns:w16du="http://schemas.microsoft.com/office/word/2023/wordml/word16du" xmlns:wne="http://schemas.microsoft.com/office/word/2006/wordml" mc:Ignorable="w14 w15 w16se w16cid w16 w16cex w16sdtdh w16sdtfl w16du wp14">
   <w:body>
     <w:p>
       <w:pPr>
@@ -179,7 +179,7 @@
           <w:kern w:val="0"/>
           <w14:ligatures w14:val="none"/>
         </w:rPr>
-        <w:t>Reframing Decisions (approved/rejected/partial)</w:t>
+        <w:t>JSON Ledger Sidecar (machine-readable companion consumed by the Module 2/3 verification harness)</w:t>
       </w:r>
     </w:p>
     <w:p>
@@ -201,6 +201,28 @@
           <w:kern w:val="0"/>
           <w14:ligatures w14:val="none"/>
         </w:rPr>
+        <w:t>Reframing Decisions (approved/rejected/partial)</w:t>
+      </w:r>
+    </w:p>
+    <w:p>
+      <w:pPr>
+        <w:numPr>
+          <w:ilvl w:val="0"/>
+          <w:numId w:val="1"/>
+        </w:numPr>
+        <w:spacing w:before="100" w:beforeAutospacing="1" w:after="100" w:afterAutospacing="1" w:line="240" w:lineRule="auto"/>
+        <w:rPr>
+          <w:rFonts w:ascii="Times New Roman" w:eastAsia="Times New Roman" w:hAnsi="Times New Roman" w:cs="Times New Roman"/>
+          <w:kern w:val="0"/>
+          <w14:ligatures w14:val="none"/>
+        </w:rPr>
+      </w:pPr>
+      <w:r>
+        <w:rPr>
+          <w:rFonts w:ascii="Times New Roman" w:eastAsia="Times New Roman" w:hAnsi="Times New Roman" w:cs="Times New Roman"/>
+          <w:kern w:val="0"/>
+          <w14:ligatures w14:val="none"/>
+        </w:rPr>
         <w:t>Go/No-Go Verdict</w:t>
       </w:r>
     </w:p>
@@ -262,7 +284,7 @@
         </w:rPr>
       </w:pPr>
       <w:r>
-        <w:pict w14:anchorId="18654F5E">
+        <w:pict w14:anchorId="071E216E">
           <v:rect id="Horizontal Line 1" o:spid="_x0000_s1068" alt="" style="width:468pt;height:.05pt;visibility:visible;mso-wrap-style:square;mso-width-percent:0;mso-height-percent:0;mso-left-percent:-10001;mso-top-percent:-10001;mso-position-horizontal:absolute;mso-position-horizontal-relative:char;mso-position-vertical:absolute;mso-position-vertical-relative:line;mso-width-percent:0;mso-height-percent:0;mso-left-percent:-10001;mso-top-percent:-10001;v-text-anchor:top" filled="f">
             <o:lock v:ext="edit" rotation="t" aspectratio="t" verticies="t" text="t" shapetype="t"/>
             <w10:anchorlock/>
@@ -325,7 +347,7 @@
         </w:rPr>
       </w:pPr>
       <w:r>
-        <w:pict w14:anchorId="280961D4">
+        <w:pict w14:anchorId="0780CCF5">
           <v:rect id="Horizontal Line 2" o:spid="_x0000_s1067" alt="" style="width:468pt;height:.05pt;visibility:visible;mso-wrap-style:square;mso-width-percent:0;mso-height-percent:0;mso-left-percent:-10001;mso-top-percent:-10001;mso-position-horizontal:absolute;mso-position-horizontal-relative:char;mso-position-vertical:absolute;mso-position-vertical-relative:line;mso-width-percent:0;mso-height-percent:0;mso-left-percent:-10001;mso-top-percent:-10001;v-text-anchor:top" filled="f">
             <o:lock v:ext="edit" rotation="t" aspectratio="t" verticies="t" text="t" shapetype="t"/>
             <w10:anchorlock/>
@@ -357,7 +379,6 @@
           <w:szCs w:val="36"/>
           <w14:ligatures w14:val="none"/>
         </w:rPr>
-        <w:lastRenderedPageBreak/>
         <w:t>VISUAL FORMATTING RULES (Global)</w:t>
       </w:r>
     </w:p>
@@ -1313,7 +1334,7 @@
         </w:rPr>
       </w:pPr>
       <w:r>
-        <w:pict w14:anchorId="0181D9D4">
+        <w:pict w14:anchorId="726A0B3F">
           <v:rect id="Horizontal Line 3" o:spid="_x0000_s1066" alt="" style="width:468pt;height:.05pt;visibility:visible;mso-wrap-style:square;mso-width-percent:0;mso-height-percent:0;mso-left-percent:-10001;mso-top-percent:-10001;mso-position-horizontal:absolute;mso-position-horizontal-relative:char;mso-position-vertical:absolute;mso-position-vertical-relative:line;mso-width-percent:0;mso-height-percent:0;mso-left-percent:-10001;mso-top-percent:-10001;v-text-anchor:top" filled="f">
             <o:lock v:ext="edit" rotation="t" aspectratio="t" verticies="t" text="t" shapetype="t"/>
             <w10:anchorlock/>
@@ -1345,7 +1366,6 @@
           <w:szCs w:val="36"/>
           <w14:ligatures w14:val="none"/>
         </w:rPr>
-        <w:lastRenderedPageBreak/>
         <w:t>INPUTS REQUIRED</w:t>
       </w:r>
     </w:p>
@@ -1478,7 +1498,7 @@
         </w:rPr>
       </w:pPr>
       <w:r>
-        <w:pict w14:anchorId="0E98AE09">
+        <w:pict w14:anchorId="7DAD6068">
           <v:rect id="Horizontal Line 4" o:spid="_x0000_s1065" alt="" style="width:468pt;height:.05pt;visibility:visible;mso-wrap-style:square;mso-width-percent:0;mso-height-percent:0;mso-left-percent:-10001;mso-top-percent:-10001;mso-position-horizontal:absolute;mso-position-horizontal-relative:char;mso-position-vertical:absolute;mso-position-vertical-relative:line;mso-width-percent:0;mso-height-percent:0;mso-left-percent:-10001;mso-top-percent:-10001;v-text-anchor:top" filled="f">
             <o:lock v:ext="edit" rotation="t" aspectratio="t" verticies="t" text="t" shapetype="t"/>
             <w10:anchorlock/>
@@ -2223,6 +2243,7 @@
                 <w:kern w:val="0"/>
                 <w14:ligatures w14:val="none"/>
               </w:rPr>
+              <w:lastRenderedPageBreak/>
               <w:t>LIKELY_MUST</w:t>
             </w:r>
           </w:p>
@@ -2305,7 +2326,6 @@
                 <w:kern w:val="0"/>
                 <w14:ligatures w14:val="none"/>
               </w:rPr>
-              <w:lastRenderedPageBreak/>
               <w:t>ADVISORY</w:t>
             </w:r>
           </w:p>
@@ -2702,12 +2722,12 @@
     </w:p>
     <w:p>
       <w:r>
+        <w:lastRenderedPageBreak/>
         <w:t>- If a requirement is listed under a "Preferred" header, it is ADVISORY — even if the text describes a core job function. Do not upgrade to LIKELY_MUST or MUST.</w:t>
       </w:r>
     </w:p>
     <w:p>
       <w:r>
-        <w:lastRenderedPageBreak/>
         <w:t>The employer chose where to place each requirement. Respect that placement.</w:t>
       </w:r>
     </w:p>
@@ -2835,7 +2855,7 @@
         </w:rPr>
       </w:pPr>
       <w:r>
-        <w:pict w14:anchorId="1BEA89C5">
+        <w:pict w14:anchorId="543B1A7E">
           <v:rect id="Horizontal Line 5" o:spid="_x0000_s1064" alt="" style="width:468pt;height:.05pt;visibility:visible;mso-wrap-style:square;mso-width-percent:0;mso-height-percent:0;mso-left-percent:-10001;mso-top-percent:-10001;mso-position-horizontal:absolute;mso-position-horizontal-relative:char;mso-position-vertical:absolute;mso-position-vertical-relative:line;mso-width-percent:0;mso-height-percent:0;mso-left-percent:-10001;mso-top-percent:-10001;v-text-anchor:top" filled="f">
             <o:lock v:ext="edit" rotation="t" aspectratio="t" verticies="t" text="t" shapetype="t"/>
             <w10:anchorlock/>
@@ -3380,7 +3400,7 @@
         </w:rPr>
       </w:pPr>
       <w:r>
-        <w:pict w14:anchorId="05F70184">
+        <w:pict w14:anchorId="152196CA">
           <v:rect id="Horizontal Line 6" o:spid="_x0000_s1063" alt="" style="width:468pt;height:.05pt;visibility:visible;mso-wrap-style:square;mso-width-percent:0;mso-height-percent:0;mso-left-percent:-10001;mso-top-percent:-10001;mso-position-horizontal:absolute;mso-position-horizontal-relative:char;mso-position-vertical:absolute;mso-position-vertical-relative:line;mso-width-percent:0;mso-height-percent:0;mso-left-percent:-10001;mso-top-percent:-10001;v-text-anchor:top" filled="f">
             <o:lock v:ext="edit" rotation="t" aspectratio="t" verticies="t" text="t" shapetype="t"/>
             <w10:anchorlock/>
@@ -3447,11 +3467,8 @@
         </w:rPr>
       </w:pPr>
       <w:r>
-        <w:t xml:space="preserve">USER CONFIRMATION (MANDATORY): After detecting Application Type, present to user: 'Detected Application Type: [CAREER_CHANGE / SAME_FIELD / INTERNAL_TRANSFER]. Confirm or correct.' Do not proceed to Target Role Level </w:t>
-      </w:r>
-      <w:r>
         <w:lastRenderedPageBreak/>
-        <w:t>detection until user confirms. CAREER_CHANGE activates 16+ conditional rules in Module 2; misclassification silently skips all of them.</w:t>
+        <w:t>USER CONFIRMATION (MANDATORY): After detecting Application Type, present to user: 'Detected Application Type: [CAREER_CHANGE / SAME_FIELD / INTERNAL_TRANSFER]. Confirm or correct.' Do not proceed to Target Role Level detection until user confirms. CAREER_CHANGE activates 16+ conditional rules in Module 2; misclassification silently skips all of them.</w:t>
       </w:r>
     </w:p>
     <w:p>
@@ -4687,7 +4704,7 @@
         </w:rPr>
       </w:pPr>
       <w:r>
-        <w:pict w14:anchorId="3BA9B84E">
+        <w:pict w14:anchorId="0105A64D">
           <v:rect id="Horizontal Line 7" o:spid="_x0000_s1062" alt="" style="width:468pt;height:.05pt;visibility:visible;mso-wrap-style:square;mso-width-percent:0;mso-height-percent:0;mso-left-percent:-10001;mso-top-percent:-10001;mso-position-horizontal:absolute;mso-position-horizontal-relative:char;mso-position-vertical:absolute;mso-position-vertical-relative:line;mso-width-percent:0;mso-height-percent:0;mso-left-percent:-10001;mso-top-percent:-10001;v-text-anchor:top" filled="f">
             <o:lock v:ext="edit" rotation="t" aspectratio="t" verticies="t" text="t" shapetype="t"/>
             <w10:anchorlock/>
@@ -4743,6 +4760,7 @@
           <w:kern w:val="0"/>
           <w14:ligatures w14:val="none"/>
         </w:rPr>
+        <w:lastRenderedPageBreak/>
         <w:t>ATS_Profile:</w:t>
       </w:r>
       <w:r>
@@ -4807,7 +4825,6 @@
           <w:kern w:val="0"/>
           <w14:ligatures w14:val="none"/>
         </w:rPr>
-        <w:lastRenderedPageBreak/>
         <w:t>ATS_Lock:</w:t>
       </w:r>
       <w:r>
@@ -4829,7 +4846,7 @@
         </w:rPr>
       </w:pPr>
       <w:r>
-        <w:pict w14:anchorId="5517F44D">
+        <w:pict w14:anchorId="1606C4E4">
           <v:rect id="Horizontal Line 8" o:spid="_x0000_s1061" alt="" style="width:468pt;height:.05pt;visibility:visible;mso-wrap-style:square;mso-width-percent:0;mso-height-percent:0;mso-left-percent:-10001;mso-top-percent:-10001;mso-position-horizontal:absolute;mso-position-horizontal-relative:char;mso-position-vertical:absolute;mso-position-vertical-relative:line;mso-width-percent:0;mso-height-percent:0;mso-left-percent:-10001;mso-top-percent:-10001;v-text-anchor:top" filled="f">
             <o:lock v:ext="edit" rotation="t" aspectratio="t" verticies="t" text="t" shapetype="t"/>
             <w10:anchorlock/>
@@ -5907,6 +5924,7 @@
           <w:kern w:val="0"/>
           <w14:ligatures w14:val="none"/>
         </w:rPr>
+        <w:lastRenderedPageBreak/>
         <w:t>PROJECT CASE-STUDY FORMAT (business-centric framing):</w:t>
       </w:r>
     </w:p>
@@ -5925,7 +5943,6 @@
           <w:kern w:val="0"/>
           <w14:ligatures w14:val="none"/>
         </w:rPr>
-        <w:lastRenderedPageBreak/>
         <w:t>For each project, use three bolded headers:</w:t>
       </w:r>
     </w:p>
@@ -6035,7 +6052,7 @@
         </w:rPr>
       </w:pPr>
       <w:r>
-        <w:pict w14:anchorId="54E31E2B">
+        <w:pict w14:anchorId="082824A5">
           <v:rect id="Horizontal Line 9" o:spid="_x0000_s1060" alt="" style="width:468pt;height:.05pt;visibility:visible;mso-wrap-style:square;mso-width-percent:0;mso-height-percent:0;mso-left-percent:-10001;mso-top-percent:-10001;mso-position-horizontal:absolute;mso-position-horizontal-relative:char;mso-position-vertical:absolute;mso-position-vertical-relative:line;mso-width-percent:0;mso-height-percent:0;mso-left-percent:-10001;mso-top-percent:-10001;v-text-anchor:top" filled="f">
             <o:lock v:ext="edit" rotation="t" aspectratio="t" verticies="t" text="t" shapetype="t"/>
             <w10:anchorlock/>
@@ -6338,7 +6355,7 @@
         </w:rPr>
       </w:pPr>
       <w:r>
-        <w:pict w14:anchorId="50558746">
+        <w:pict w14:anchorId="58E49590">
           <v:rect id="Horizontal Line 10" o:spid="_x0000_s1059" alt="" style="width:468pt;height:.05pt;visibility:visible;mso-wrap-style:square;mso-width-percent:0;mso-height-percent:0;mso-left-percent:-10001;mso-top-percent:-10001;mso-position-horizontal:absolute;mso-position-horizontal-relative:char;mso-position-vertical:absolute;mso-position-vertical-relative:line;mso-width-percent:0;mso-height-percent:0;mso-left-percent:-10001;mso-top-percent:-10001;v-text-anchor:top" filled="f">
             <o:lock v:ext="edit" rotation="t" aspectratio="t" verticies="t" text="t" shapetype="t"/>
             <w10:anchorlock/>
@@ -6987,7 +7004,7 @@
         </w:rPr>
       </w:pPr>
       <w:r>
-        <w:pict w14:anchorId="20C3601E">
+        <w:pict w14:anchorId="253D1D47">
           <v:rect id="Horizontal Line 11" o:spid="_x0000_s1058" alt="" style="width:468pt;height:.05pt;visibility:visible;mso-wrap-style:square;mso-width-percent:0;mso-height-percent:0;mso-left-percent:-10001;mso-top-percent:-10001;mso-position-horizontal:absolute;mso-position-horizontal-relative:char;mso-position-vertical:absolute;mso-position-vertical-relative:line;mso-width-percent:0;mso-height-percent:0;mso-left-percent:-10001;mso-top-percent:-10001;v-text-anchor:top" filled="f">
             <o:lock v:ext="edit" rotation="t" aspectratio="t" verticies="t" text="t" shapetype="t"/>
             <w10:anchorlock/>
@@ -7050,7 +7067,7 @@
         </w:rPr>
       </w:pPr>
       <w:r>
-        <w:pict w14:anchorId="3BB3FC7B">
+        <w:pict w14:anchorId="106145EB">
           <v:rect id="Horizontal Line 12" o:spid="_x0000_s1057" alt="" style="width:468pt;height:.05pt;visibility:visible;mso-wrap-style:square;mso-width-percent:0;mso-height-percent:0;mso-left-percent:-10001;mso-top-percent:-10001;mso-position-horizontal:absolute;mso-position-horizontal-relative:char;mso-position-vertical:absolute;mso-position-vertical-relative:line;mso-width-percent:0;mso-height-percent:0;mso-left-percent:-10001;mso-top-percent:-10001;v-text-anchor:top" filled="f">
             <o:lock v:ext="edit" rotation="t" aspectratio="t" verticies="t" text="t" shapetype="t"/>
             <w10:anchorlock/>
@@ -7179,7 +7196,7 @@
         </w:rPr>
       </w:pPr>
       <w:r>
-        <w:pict w14:anchorId="7E1663AB">
+        <w:pict w14:anchorId="04659BEA">
           <v:rect id="Horizontal Line 13" o:spid="_x0000_s1056" alt="" style="width:468pt;height:.05pt;visibility:visible;mso-wrap-style:square;mso-width-percent:0;mso-height-percent:0;mso-left-percent:-10001;mso-top-percent:-10001;mso-position-horizontal:absolute;mso-position-horizontal-relative:char;mso-position-vertical:absolute;mso-position-vertical-relative:line;mso-width-percent:0;mso-height-percent:0;mso-left-percent:-10001;mso-top-percent:-10001;v-text-anchor:top" filled="f">
             <o:lock v:ext="edit" rotation="t" aspectratio="t" verticies="t" text="t" shapetype="t"/>
             <w10:anchorlock/>
@@ -7574,6 +7591,7 @@
                 <w:kern w:val="0"/>
                 <w14:ligatures w14:val="none"/>
               </w:rPr>
+              <w:lastRenderedPageBreak/>
               <w:t>Pruned</w:t>
             </w:r>
           </w:p>
@@ -7631,7 +7649,6 @@
                 <w:kern w:val="0"/>
                 <w14:ligatures w14:val="none"/>
               </w:rPr>
-              <w:lastRenderedPageBreak/>
               <w:t>Frozen</w:t>
             </w:r>
           </w:p>
@@ -8688,6 +8705,7 @@
           <w:kern w:val="0"/>
           <w14:ligatures w14:val="none"/>
         </w:rPr>
+        <w:lastRenderedPageBreak/>
         <w:t>PRIORITY WITHIN EACH TIER:</w:t>
       </w:r>
     </w:p>
@@ -8710,7 +8728,6 @@
           <w:kern w:val="0"/>
           <w14:ligatures w14:val="none"/>
         </w:rPr>
-        <w:lastRenderedPageBreak/>
         <w:t>Evidence available in resume &gt; No evidence (prioritize matchable)</w:t>
       </w:r>
     </w:p>
@@ -10096,7 +10113,7 @@
         </w:rPr>
       </w:pPr>
       <w:r>
-        <w:pict w14:anchorId="4B55E2CC">
+        <w:pict w14:anchorId="6135547F">
           <v:rect id="Horizontal Line 14" o:spid="_x0000_s1055" alt="" style="width:468pt;height:.05pt;visibility:visible;mso-wrap-style:square;mso-width-percent:0;mso-height-percent:0;mso-left-percent:-10001;mso-top-percent:-10001;mso-position-horizontal:absolute;mso-position-horizontal-relative:char;mso-position-vertical:absolute;mso-position-vertical-relative:line;mso-width-percent:0;mso-height-percent:0;mso-left-percent:-10001;mso-top-percent:-10001;v-text-anchor:top" filled="f">
             <o:lock v:ext="edit" rotation="t" aspectratio="t" verticies="t" text="t" shapetype="t"/>
             <w10:anchorlock/>
@@ -10148,6 +10165,7 @@
           <w:kern w:val="0"/>
           <w14:ligatures w14:val="none"/>
         </w:rPr>
+        <w:lastRenderedPageBreak/>
         <w:t>DISTINCT EMPLOYMENT POSITIONS DEFINITION:</w:t>
       </w:r>
     </w:p>
@@ -10170,7 +10188,6 @@
           <w:kern w:val="0"/>
           <w14:ligatures w14:val="none"/>
         </w:rPr>
-        <w:lastRenderedPageBreak/>
         <w:t>Each unique (Company + Title + Date Range) combination = 1 position</w:t>
       </w:r>
     </w:p>
@@ -11373,6 +11390,7 @@
     </w:p>
     <w:p>
       <w:r>
+        <w:lastRenderedPageBreak/>
         <w:t>Now executing: -&gt; Gate 0: Evidence Discovery (Question Generation + Archive Matching)</w:t>
       </w:r>
     </w:p>
@@ -11502,7 +11520,7 @@
         </w:rPr>
       </w:pPr>
       <w:r>
-        <w:pict w14:anchorId="044F054F">
+        <w:pict w14:anchorId="7D7C9A76">
           <v:rect id="Horizontal Line 15" o:spid="_x0000_s1054" alt="" style="width:468pt;height:.05pt;visibility:visible;mso-wrap-style:square;mso-width-percent:0;mso-height-percent:0;mso-left-percent:-10001;mso-top-percent:-10001;mso-position-horizontal:absolute;mso-position-horizontal-relative:char;mso-position-vertical:absolute;mso-position-vertical-relative:line;mso-width-percent:0;mso-height-percent:0;mso-left-percent:-10001;mso-top-percent:-10001;v-text-anchor:top" filled="f">
             <o:lock v:ext="edit" rotation="t" aspectratio="t" verticies="t" text="t" shapetype="t"/>
             <w10:anchorlock/>
@@ -12022,6 +12040,7 @@
                 <w:kern w:val="0"/>
                 <w14:ligatures w14:val="none"/>
               </w:rPr>
+              <w:lastRenderedPageBreak/>
               <w:t>1-2</w:t>
             </w:r>
           </w:p>
@@ -12182,7 +12201,6 @@
                 <w:kern w:val="0"/>
                 <w14:ligatures w14:val="none"/>
               </w:rPr>
-              <w:lastRenderedPageBreak/>
               <w:t>5+</w:t>
             </w:r>
           </w:p>
@@ -12760,6 +12778,7 @@
           <w:kern w:val="0"/>
           <w14:ligatures w14:val="none"/>
         </w:rPr>
+        <w:lastRenderedPageBreak/>
         <w:t>B. REFRAMING QUESTIONS (require judgment about honest framing):</w:t>
       </w:r>
     </w:p>
@@ -12804,7 +12823,6 @@
           <w:kern w:val="0"/>
           <w14:ligatures w14:val="none"/>
         </w:rPr>
-        <w:lastRenderedPageBreak/>
         <w:t>"Was [your work] essentially [JD concept]?"</w:t>
       </w:r>
     </w:p>
@@ -13009,6 +13027,7 @@
           <w:kern w:val="0"/>
           <w14:ligatures w14:val="none"/>
         </w:rPr>
+        <w:lastRenderedPageBreak/>
         <w:t>High-yield question templates (select 2-4 per resume):</w:t>
       </w:r>
     </w:p>
@@ -13031,7 +13050,6 @@
           <w:kern w:val="0"/>
           <w14:ligatures w14:val="none"/>
         </w:rPr>
-        <w:lastRenderedPageBreak/>
         <w:t>"How did you get involved in [accomplishment]? Was it assigned, or did you create/propose the opportunity?"</w:t>
       </w:r>
     </w:p>
@@ -13946,6 +13964,7 @@
           <w:szCs w:val="20"/>
           <w14:ligatures w14:val="none"/>
         </w:rPr>
+        <w:lastRenderedPageBreak/>
         <w:t xml:space="preserve">  - Hidden Evidence probes: minimum 2</w:t>
       </w:r>
     </w:p>
@@ -14006,7 +14025,6 @@
           <w:kern w:val="0"/>
           <w14:ligatures w14:val="none"/>
         </w:rPr>
-        <w:lastRenderedPageBreak/>
         <w:t>DEDUPLICATION CHECK (before finalizing question list):</w:t>
       </w:r>
     </w:p>
@@ -15513,6 +15531,7 @@
           <w:szCs w:val="20"/>
           <w14:ligatures w14:val="none"/>
         </w:rPr>
+        <w:lastRenderedPageBreak/>
         <w:t>Total: [N] questions generated</w:t>
       </w:r>
     </w:p>
@@ -15553,7 +15572,6 @@
           <w:kern w:val="0"/>
           <w14:ligatures w14:val="none"/>
         </w:rPr>
-        <w:lastRenderedPageBreak/>
         <w:t>If Archive WAS detected at start of STEP 1:</w:t>
       </w:r>
     </w:p>
@@ -16680,6 +16698,7 @@
           <w:kern w:val="0"/>
           <w14:ligatures w14:val="none"/>
         </w:rPr>
+        <w:lastRenderedPageBreak/>
         <w:t>Proceed to Step 3</w:t>
       </w:r>
     </w:p>
@@ -16700,7 +16719,6 @@
           <w:kern w:val="0"/>
           <w14:ligatures w14:val="none"/>
         </w:rPr>
-        <w:lastRenderedPageBreak/>
         <w:t>Why deferred insertion helps:</w:t>
       </w:r>
       <w:r>
@@ -16722,7 +16740,7 @@
         </w:rPr>
       </w:pPr>
       <w:r>
-        <w:pict w14:anchorId="733C2C3A">
+        <w:pict w14:anchorId="6674F9D6">
           <v:rect id="Horizontal Line 16" o:spid="_x0000_s1053" alt="" style="width:468pt;height:.05pt;visibility:visible;mso-wrap-style:square;mso-width-percent:0;mso-height-percent:0;mso-left-percent:-10001;mso-top-percent:-10001;mso-position-horizontal:absolute;mso-position-horizontal-relative:char;mso-position-vertical:absolute;mso-position-vertical-relative:line;mso-width-percent:0;mso-height-percent:0;mso-left-percent:-10001;mso-top-percent:-10001;v-text-anchor:top" filled="f">
             <o:lock v:ext="edit" rotation="t" aspectratio="t" verticies="t" text="t" shapetype="t"/>
             <w10:anchorlock/>
@@ -16990,6 +17008,7 @@
           <w:kern w:val="0"/>
           <w14:ligatures w14:val="none"/>
         </w:rPr>
+        <w:lastRenderedPageBreak/>
         <w:t>Questions have already been generated in Step 1 based solely on JD analysis and resume gaps. The Q&amp;A document does NOT influence which questions were asked.</w:t>
       </w:r>
     </w:p>
@@ -17008,7 +17027,6 @@
           <w:kern w:val="0"/>
           <w14:ligatures w14:val="none"/>
         </w:rPr>
-        <w:lastRenderedPageBreak/>
         <w:t>Match ONLY FACTUAL questions against the Q&amp;A document. REFRAMING questions are NEVER matched—they always go directly to Phase B regardless of any prior approvals from other JDs.</w:t>
       </w:r>
     </w:p>
@@ -17583,7 +17601,7 @@
         </w:rPr>
       </w:pPr>
       <w:r>
-        <w:pict w14:anchorId="737577D2">
+        <w:pict w14:anchorId="4D6D3DDC">
           <v:rect id="Horizontal Line 17" o:spid="_x0000_s1052" alt="" style="width:468pt;height:.05pt;visibility:visible;mso-wrap-style:square;mso-width-percent:0;mso-height-percent:0;mso-left-percent:-10001;mso-top-percent:-10001;mso-position-horizontal:absolute;mso-position-horizontal-relative:char;mso-position-vertical:absolute;mso-position-vertical-relative:line;mso-width-percent:0;mso-height-percent:0;mso-left-percent:-10001;mso-top-percent:-10001;v-text-anchor:top" filled="f">
             <o:lock v:ext="edit" rotation="t" aspectratio="t" verticies="t" text="t" shapetype="t"/>
             <w10:anchorlock/>
@@ -19044,7 +19062,7 @@
         </w:rPr>
       </w:pPr>
       <w:r>
-        <w:pict w14:anchorId="3DCD65D4">
+        <w:pict w14:anchorId="5F8B16F8">
           <v:rect id="Horizontal Line 18" o:spid="_x0000_s1051" alt="" style="width:468pt;height:.05pt;visibility:visible;mso-wrap-style:square;mso-width-percent:0;mso-height-percent:0;mso-left-percent:-10001;mso-top-percent:-10001;mso-position-horizontal:absolute;mso-position-horizontal-relative:char;mso-position-vertical:absolute;mso-position-vertical-relative:line;mso-width-percent:0;mso-height-percent:0;mso-left-percent:-10001;mso-top-percent:-10001;v-text-anchor:top" filled="f">
             <o:lock v:ext="edit" rotation="t" aspectratio="t" verticies="t" text="t" shapetype="t"/>
             <w10:anchorlock/>
@@ -19646,7 +19664,7 @@
         </w:rPr>
       </w:pPr>
       <w:r>
-        <w:pict w14:anchorId="63B5EC47">
+        <w:pict w14:anchorId="7837B1A4">
           <v:rect id="Horizontal Line 19" o:spid="_x0000_s1050" alt="" style="width:468pt;height:.05pt;visibility:visible;mso-wrap-style:square;mso-width-percent:0;mso-height-percent:0;mso-left-percent:-10001;mso-top-percent:-10001;mso-position-horizontal:absolute;mso-position-horizontal-relative:char;mso-position-vertical:absolute;mso-position-vertical-relative:line;mso-width-percent:0;mso-height-percent:0;mso-left-percent:-10001;mso-top-percent:-10001;v-text-anchor:top" filled="f">
             <o:lock v:ext="edit" rotation="t" aspectratio="t" verticies="t" text="t" shapetype="t"/>
             <w10:anchorlock/>
@@ -19947,7 +19965,7 @@
         </w:rPr>
       </w:pPr>
       <w:r>
-        <w:pict w14:anchorId="33BD6E9D">
+        <w:pict w14:anchorId="17165B44">
           <v:rect id="Horizontal Line 20" o:spid="_x0000_s1049" alt="" style="width:468pt;height:.05pt;visibility:visible;mso-wrap-style:square;mso-width-percent:0;mso-height-percent:0;mso-left-percent:-10001;mso-top-percent:-10001;mso-position-horizontal:absolute;mso-position-horizontal-relative:char;mso-position-vertical:absolute;mso-position-vertical-relative:line;mso-width-percent:0;mso-height-percent:0;mso-left-percent:-10001;mso-top-percent:-10001;v-text-anchor:top" filled="f">
             <o:lock v:ext="edit" rotation="t" aspectratio="t" verticies="t" text="t" shapetype="t"/>
             <w10:anchorlock/>
@@ -20520,7 +20538,7 @@
         </w:rPr>
       </w:pPr>
       <w:r>
-        <w:pict w14:anchorId="68E3758C">
+        <w:pict w14:anchorId="4E7C66CD">
           <v:rect id="Horizontal Line 21" o:spid="_x0000_s1048" alt="" style="width:468pt;height:.05pt;visibility:visible;mso-wrap-style:square;mso-width-percent:0;mso-height-percent:0;mso-left-percent:-10001;mso-top-percent:-10001;mso-position-horizontal:absolute;mso-position-horizontal-relative:char;mso-position-vertical:absolute;mso-position-vertical-relative:line;mso-width-percent:0;mso-height-percent:0;mso-left-percent:-10001;mso-top-percent:-10001;v-text-anchor:top" filled="f">
             <o:lock v:ext="edit" rotation="t" aspectratio="t" verticies="t" text="t" shapetype="t"/>
             <w10:anchorlock/>
@@ -21078,7 +21096,7 @@
         </w:rPr>
       </w:pPr>
       <w:r>
-        <w:pict w14:anchorId="002B5A29">
+        <w:pict w14:anchorId="5200155F">
           <v:rect id="Horizontal Line 22" o:spid="_x0000_s1047" alt="" style="width:468pt;height:.05pt;visibility:visible;mso-wrap-style:square;mso-width-percent:0;mso-height-percent:0;mso-left-percent:-10001;mso-top-percent:-10001;mso-position-horizontal:absolute;mso-position-horizontal-relative:char;mso-position-vertical:absolute;mso-position-vertical-relative:line;mso-width-percent:0;mso-height-percent:0;mso-left-percent:-10001;mso-top-percent:-10001;v-text-anchor:top" filled="f">
             <o:lock v:ext="edit" rotation="t" aspectratio="t" verticies="t" text="t" shapetype="t"/>
             <w10:anchorlock/>
@@ -21200,7 +21218,7 @@
         </w:rPr>
       </w:pPr>
       <w:r>
-        <w:pict w14:anchorId="74C1E202">
+        <w:pict w14:anchorId="7BEEB486">
           <v:rect id="Horizontal Line 23" o:spid="_x0000_s1046" alt="" style="width:468pt;height:.05pt;visibility:visible;mso-wrap-style:square;mso-width-percent:0;mso-height-percent:0;mso-left-percent:-10001;mso-top-percent:-10001;mso-position-horizontal:absolute;mso-position-horizontal-relative:char;mso-position-vertical:absolute;mso-position-vertical-relative:line;mso-width-percent:0;mso-height-percent:0;mso-left-percent:-10001;mso-top-percent:-10001;v-text-anchor:top" filled="f">
             <o:lock v:ext="edit" rotation="t" aspectratio="t" verticies="t" text="t" shapetype="t"/>
             <w10:anchorlock/>
@@ -21614,7 +21632,7 @@
         </w:rPr>
       </w:pPr>
       <w:r>
-        <w:pict w14:anchorId="2736A41F">
+        <w:pict w14:anchorId="7EF68907">
           <v:rect id="Horizontal Line 24" o:spid="_x0000_s1045" alt="" style="width:468pt;height:.05pt;visibility:visible;mso-wrap-style:square;mso-width-percent:0;mso-height-percent:0;mso-left-percent:-10001;mso-top-percent:-10001;mso-position-horizontal:absolute;mso-position-horizontal-relative:char;mso-position-vertical:absolute;mso-position-vertical-relative:line;mso-width-percent:0;mso-height-percent:0;mso-left-percent:-10001;mso-top-percent:-10001;v-text-anchor:top" filled="f">
             <o:lock v:ext="edit" rotation="t" aspectratio="t" verticies="t" text="t" shapetype="t"/>
             <w10:anchorlock/>
@@ -21697,7 +21715,7 @@
         </w:rPr>
       </w:pPr>
       <w:r>
-        <w:pict w14:anchorId="2BC524D6">
+        <w:pict w14:anchorId="7A221860">
           <v:rect id="Horizontal Line 25" o:spid="_x0000_s1044" alt="" style="width:468pt;height:.05pt;visibility:visible;mso-wrap-style:square;mso-width-percent:0;mso-height-percent:0;mso-left-percent:-10001;mso-top-percent:-10001;mso-position-horizontal:absolute;mso-position-horizontal-relative:char;mso-position-vertical:absolute;mso-position-vertical-relative:line;mso-width-percent:0;mso-height-percent:0;mso-left-percent:-10001;mso-top-percent:-10001;v-text-anchor:top" filled="f">
             <o:lock v:ext="edit" rotation="t" aspectratio="t" verticies="t" text="t" shapetype="t"/>
             <w10:anchorlock/>
@@ -24368,7 +24386,7 @@
         </w:rPr>
       </w:pPr>
       <w:r>
-        <w:pict w14:anchorId="7F8A5847">
+        <w:pict w14:anchorId="5E8BC62E">
           <v:rect id="Horizontal Line 26" o:spid="_x0000_s1043" alt="" style="width:468pt;height:.05pt;visibility:visible;mso-wrap-style:square;mso-width-percent:0;mso-height-percent:0;mso-left-percent:-10001;mso-top-percent:-10001;mso-position-horizontal:absolute;mso-position-horizontal-relative:char;mso-position-vertical:absolute;mso-position-vertical-relative:line;mso-width-percent:0;mso-height-percent:0;mso-left-percent:-10001;mso-top-percent:-10001;v-text-anchor:top" filled="f">
             <o:lock v:ext="edit" rotation="t" aspectratio="t" verticies="t" text="t" shapetype="t"/>
             <w10:anchorlock/>
@@ -25763,7 +25781,7 @@
         </w:rPr>
       </w:pPr>
       <w:r>
-        <w:pict w14:anchorId="30CC10A8">
+        <w:pict w14:anchorId="74C85FE9">
           <v:rect id="Horizontal Line 27" o:spid="_x0000_s1042" alt="" style="width:468pt;height:.05pt;visibility:visible;mso-wrap-style:square;mso-width-percent:0;mso-height-percent:0;mso-left-percent:-10001;mso-top-percent:-10001;mso-position-horizontal:absolute;mso-position-horizontal-relative:char;mso-position-vertical:absolute;mso-position-vertical-relative:line;mso-width-percent:0;mso-height-percent:0;mso-left-percent:-10001;mso-top-percent:-10001;v-text-anchor:top" filled="f">
             <o:lock v:ext="edit" rotation="t" aspectratio="t" verticies="t" text="t" shapetype="t"/>
             <w10:anchorlock/>
@@ -27246,7 +27264,7 @@
         </w:rPr>
       </w:pPr>
       <w:r>
-        <w:pict w14:anchorId="4ADF19D1">
+        <w:pict w14:anchorId="0160945A">
           <v:rect id="Horizontal Line 28" o:spid="_x0000_s1041" alt="" style="width:468pt;height:.05pt;visibility:visible;mso-wrap-style:square;mso-width-percent:0;mso-height-percent:0;mso-left-percent:-10001;mso-top-percent:-10001;mso-position-horizontal:absolute;mso-position-horizontal-relative:char;mso-position-vertical:absolute;mso-position-vertical-relative:line;mso-width-percent:0;mso-height-percent:0;mso-left-percent:-10001;mso-top-percent:-10001;v-text-anchor:top" filled="f">
             <o:lock v:ext="edit" rotation="t" aspectratio="t" verticies="t" text="t" shapetype="t"/>
             <w10:anchorlock/>
@@ -28156,7 +28174,7 @@
         </w:rPr>
       </w:pPr>
       <w:r>
-        <w:pict w14:anchorId="3AAAE32B">
+        <w:pict w14:anchorId="48DC7470">
           <v:rect id="Horizontal Line 29" o:spid="_x0000_s1040" alt="" style="width:468pt;height:.05pt;visibility:visible;mso-wrap-style:square;mso-width-percent:0;mso-height-percent:0;mso-left-percent:-10001;mso-top-percent:-10001;mso-position-horizontal:absolute;mso-position-horizontal-relative:char;mso-position-vertical:absolute;mso-position-vertical-relative:line;mso-width-percent:0;mso-height-percent:0;mso-left-percent:-10001;mso-top-percent:-10001;v-text-anchor:top" filled="f">
             <o:lock v:ext="edit" rotation="t" aspectratio="t" verticies="t" text="t" shapetype="t"/>
             <w10:anchorlock/>
@@ -28684,7 +28702,7 @@
         </w:rPr>
       </w:pPr>
       <w:r>
-        <w:pict w14:anchorId="76468407">
+        <w:pict w14:anchorId="22333DF4">
           <v:rect id="Horizontal Line 30" o:spid="_x0000_s1039" alt="" style="width:468pt;height:.05pt;visibility:visible;mso-wrap-style:square;mso-width-percent:0;mso-height-percent:0;mso-left-percent:-10001;mso-top-percent:-10001;mso-position-horizontal:absolute;mso-position-horizontal-relative:char;mso-position-vertical:absolute;mso-position-vertical-relative:line;mso-width-percent:0;mso-height-percent:0;mso-left-percent:-10001;mso-top-percent:-10001;v-text-anchor:top" filled="f">
             <o:lock v:ext="edit" rotation="t" aspectratio="t" verticies="t" text="t" shapetype="t"/>
             <w10:anchorlock/>
@@ -29806,7 +29824,7 @@
         </w:rPr>
       </w:pPr>
       <w:r>
-        <w:pict w14:anchorId="7BE6F60A">
+        <w:pict w14:anchorId="2CA670C6">
           <v:rect id="Horizontal Line 31" o:spid="_x0000_s1038" alt="" style="width:468pt;height:.05pt;visibility:visible;mso-wrap-style:square;mso-width-percent:0;mso-height-percent:0;mso-left-percent:-10001;mso-top-percent:-10001;mso-position-horizontal:absolute;mso-position-horizontal-relative:char;mso-position-vertical:absolute;mso-position-vertical-relative:line;mso-width-percent:0;mso-height-percent:0;mso-left-percent:-10001;mso-top-percent:-10001;v-text-anchor:top" filled="f">
             <o:lock v:ext="edit" rotation="t" aspectratio="t" verticies="t" text="t" shapetype="t"/>
             <w10:anchorlock/>
@@ -30581,7 +30599,7 @@
         </w:rPr>
       </w:pPr>
       <w:r>
-        <w:pict w14:anchorId="0489DDB0">
+        <w:pict w14:anchorId="1EBB3ED0">
           <v:rect id="Horizontal Line 32" o:spid="_x0000_s1037" alt="" style="width:468pt;height:.05pt;visibility:visible;mso-wrap-style:square;mso-width-percent:0;mso-height-percent:0;mso-left-percent:-10001;mso-top-percent:-10001;mso-position-horizontal:absolute;mso-position-horizontal-relative:char;mso-position-vertical:absolute;mso-position-vertical-relative:line;mso-width-percent:0;mso-height-percent:0;mso-left-percent:-10001;mso-top-percent:-10001;v-text-anchor:top" filled="f">
             <o:lock v:ext="edit" rotation="t" aspectratio="t" verticies="t" text="t" shapetype="t"/>
             <w10:anchorlock/>
@@ -31464,7 +31482,7 @@
         </w:rPr>
       </w:pPr>
       <w:r>
-        <w:pict w14:anchorId="38891CCC">
+        <w:pict w14:anchorId="184BA980">
           <v:rect id="Horizontal Line 33" o:spid="_x0000_s1036" alt="" style="width:468pt;height:.05pt;visibility:visible;mso-wrap-style:square;mso-width-percent:0;mso-height-percent:0;mso-left-percent:-10001;mso-top-percent:-10001;mso-position-horizontal:absolute;mso-position-horizontal-relative:char;mso-position-vertical:absolute;mso-position-vertical-relative:line;mso-width-percent:0;mso-height-percent:0;mso-left-percent:-10001;mso-top-percent:-10001;v-text-anchor:top" filled="f">
             <o:lock v:ext="edit" rotation="t" aspectratio="t" verticies="t" text="t" shapetype="t"/>
             <w10:anchorlock/>
@@ -32442,7 +32460,7 @@
         </w:rPr>
       </w:pPr>
       <w:r>
-        <w:pict w14:anchorId="538CFD20">
+        <w:pict w14:anchorId="379909F9">
           <v:rect id="Horizontal Line 34" o:spid="_x0000_s1035" alt="" style="width:468pt;height:.05pt;visibility:visible;mso-wrap-style:square;mso-width-percent:0;mso-height-percent:0;mso-left-percent:-10001;mso-top-percent:-10001;mso-position-horizontal:absolute;mso-position-horizontal-relative:char;mso-position-vertical:absolute;mso-position-vertical-relative:line;mso-width-percent:0;mso-height-percent:0;mso-left-percent:-10001;mso-top-percent:-10001;v-text-anchor:top" filled="f">
             <o:lock v:ext="edit" rotation="t" aspectratio="t" verticies="t" text="t" shapetype="t"/>
             <w10:anchorlock/>
@@ -32779,7 +32797,7 @@
         </w:rPr>
       </w:pPr>
       <w:r>
-        <w:pict w14:anchorId="2BA8EFF4">
+        <w:pict w14:anchorId="0C60C5CB">
           <v:rect id="Horizontal Line 35" o:spid="_x0000_s1034" alt="" style="width:468pt;height:.05pt;visibility:visible;mso-wrap-style:square;mso-width-percent:0;mso-height-percent:0;mso-left-percent:-10001;mso-top-percent:-10001;mso-position-horizontal:absolute;mso-position-horizontal-relative:char;mso-position-vertical:absolute;mso-position-vertical-relative:line;mso-width-percent:0;mso-height-percent:0;mso-left-percent:-10001;mso-top-percent:-10001;v-text-anchor:top" filled="f">
             <o:lock v:ext="edit" rotation="t" aspectratio="t" verticies="t" text="t" shapetype="t"/>
             <w10:anchorlock/>
@@ -32862,7 +32880,7 @@
         </w:rPr>
       </w:pPr>
       <w:r>
-        <w:pict w14:anchorId="1DDC204F">
+        <w:pict w14:anchorId="2F397D9D">
           <v:rect id="Horizontal Line 36" o:spid="_x0000_s1033" alt="" style="width:468pt;height:.05pt;visibility:visible;mso-wrap-style:square;mso-width-percent:0;mso-height-percent:0;mso-left-percent:-10001;mso-top-percent:-10001;mso-position-horizontal:absolute;mso-position-horizontal-relative:char;mso-position-vertical:absolute;mso-position-vertical-relative:line;mso-width-percent:0;mso-height-percent:0;mso-left-percent:-10001;mso-top-percent:-10001;v-text-anchor:top" filled="f">
             <o:lock v:ext="edit" rotation="t" aspectratio="t" verticies="t" text="t" shapetype="t"/>
             <w10:anchorlock/>
@@ -33351,7 +33369,7 @@
         </w:rPr>
       </w:pPr>
       <w:r>
-        <w:pict w14:anchorId="26323973">
+        <w:pict w14:anchorId="365AF8A8">
           <v:rect id="Horizontal Line 37" o:spid="_x0000_s1032" alt="" style="width:468pt;height:.05pt;visibility:visible;mso-wrap-style:square;mso-width-percent:0;mso-height-percent:0;mso-left-percent:-10001;mso-top-percent:-10001;mso-position-horizontal:absolute;mso-position-horizontal-relative:char;mso-position-vertical:absolute;mso-position-vertical-relative:line;mso-width-percent:0;mso-height-percent:0;mso-left-percent:-10001;mso-top-percent:-10001;v-text-anchor:top" filled="f">
             <o:lock v:ext="edit" rotation="t" aspectratio="t" verticies="t" text="t" shapetype="t"/>
             <w10:anchorlock/>
@@ -34523,7 +34541,7 @@
         </w:rPr>
       </w:pPr>
       <w:r>
-        <w:pict w14:anchorId="6BE6D909">
+        <w:pict w14:anchorId="5FB48AFE">
           <v:rect id="Horizontal Line 38" o:spid="_x0000_s1031" alt="" style="width:468pt;height:.05pt;visibility:visible;mso-wrap-style:square;mso-width-percent:0;mso-height-percent:0;mso-left-percent:-10001;mso-top-percent:-10001;mso-position-horizontal:absolute;mso-position-horizontal-relative:char;mso-position-vertical:absolute;mso-position-vertical-relative:line;mso-width-percent:0;mso-height-percent:0;mso-left-percent:-10001;mso-top-percent:-10001;v-text-anchor:top" filled="f">
             <o:lock v:ext="edit" rotation="t" aspectratio="t" verticies="t" text="t" shapetype="t"/>
             <w10:anchorlock/>
@@ -37663,7 +37681,7 @@
         </w:rPr>
       </w:pPr>
       <w:r>
-        <w:pict w14:anchorId="2AA2BE29">
+        <w:pict w14:anchorId="1B1C4B35">
           <v:rect id="Horizontal Line 39" o:spid="_x0000_s1030" alt="" style="width:468pt;height:.05pt;visibility:visible;mso-wrap-style:square;mso-width-percent:0;mso-height-percent:0;mso-left-percent:-10001;mso-top-percent:-10001;mso-position-horizontal:absolute;mso-position-horizontal-relative:char;mso-position-vertical:absolute;mso-position-vertical-relative:line;mso-width-percent:0;mso-height-percent:0;mso-left-percent:-10001;mso-top-percent:-10001;v-text-anchor:top" filled="f">
             <o:lock v:ext="edit" rotation="t" aspectratio="t" verticies="t" text="t" shapetype="t"/>
             <w10:anchorlock/>
@@ -38666,7 +38684,7 @@
         </w:rPr>
       </w:pPr>
       <w:r>
-        <w:pict w14:anchorId="41ACDABC">
+        <w:pict w14:anchorId="5890ED71">
           <v:rect id="Horizontal Line 40" o:spid="_x0000_s1029" alt="" style="width:468pt;height:.05pt;visibility:visible;mso-wrap-style:square;mso-width-percent:0;mso-height-percent:0;mso-left-percent:-10001;mso-top-percent:-10001;mso-position-horizontal:absolute;mso-position-horizontal-relative:char;mso-position-vertical:absolute;mso-position-vertical-relative:line;mso-width-percent:0;mso-height-percent:0;mso-left-percent:-10001;mso-top-percent:-10001;v-text-anchor:top" filled="f">
             <o:lock v:ext="edit" rotation="t" aspectratio="t" verticies="t" text="t" shapetype="t"/>
             <w10:anchorlock/>
@@ -40683,12 +40701,454 @@
         </w:rPr>
       </w:pPr>
       <w:r>
-        <w:pict w14:anchorId="0054BF14">
+        <w:pict w14:anchorId="64828FD7">
           <v:rect id="Horizontal Line 41" o:spid="_x0000_s1028" alt="" style="width:468pt;height:.05pt;visibility:visible;mso-wrap-style:square;mso-width-percent:0;mso-height-percent:0;mso-left-percent:-10001;mso-top-percent:-10001;mso-position-horizontal:absolute;mso-position-horizontal-relative:char;mso-position-vertical:absolute;mso-position-vertical-relative:line;mso-width-percent:0;mso-height-percent:0;mso-left-percent:-10001;mso-top-percent:-10001;v-text-anchor:top" filled="f">
             <o:lock v:ext="edit" rotation="t" aspectratio="t" verticies="t" text="t" shapetype="t"/>
             <w10:anchorlock/>
           </v:rect>
         </w:pict>
+      </w:r>
+    </w:p>
+    <w:p>
+      <w:pPr>
+        <w:spacing w:before="100" w:beforeAutospacing="1" w:after="100" w:afterAutospacing="1" w:line="240" w:lineRule="auto"/>
+        <w:outlineLvl w:val="1"/>
+        <w:rPr>
+          <w:rFonts w:ascii="Times New Roman" w:eastAsia="Times New Roman" w:hAnsi="Times New Roman" w:cs="Times New Roman"/>
+          <w:b/>
+          <w:bCs/>
+          <w:kern w:val="0"/>
+          <w:sz w:val="36"/>
+          <w:szCs w:val="36"/>
+          <w14:ligatures w14:val="none"/>
+        </w:rPr>
+      </w:pPr>
+      <w:r>
+        <w:rPr>
+          <w:rFonts w:ascii="Times New Roman" w:eastAsia="Times New Roman" w:hAnsi="Times New Roman" w:cs="Times New Roman"/>
+          <w:b/>
+          <w:bCs/>
+          <w:kern w:val="0"/>
+          <w:sz w:val="36"/>
+          <w:szCs w:val="36"/>
+          <w14:ligatures w14:val="none"/>
+        </w:rPr>
+        <w:t>LEDGER SIDECAR (MACHINE-READABLE — MANDATORY)</w:t>
+      </w:r>
+    </w:p>
+    <w:p>
+      <w:pPr>
+        <w:spacing w:before="100" w:beforeAutospacing="1" w:after="100" w:afterAutospacing="1" w:line="240" w:lineRule="auto"/>
+        <w:rPr>
+          <w:rFonts w:ascii="Times New Roman" w:eastAsia="Times New Roman" w:hAnsi="Times New Roman" w:cs="Times New Roman"/>
+          <w:kern w:val="0"/>
+          <w14:ligatures w14:val="none"/>
+        </w:rPr>
+      </w:pPr>
+      <w:r>
+        <w:rPr>
+          <w:rFonts w:ascii="Times New Roman" w:eastAsia="Times New Roman" w:hAnsi="Times New Roman" w:cs="Times New Roman"/>
+          <w:kern w:val="0"/>
+          <w14:ligatures w14:val="none"/>
+        </w:rPr>
+        <w:t>After printing the Evidence Ledger above, print the fenced JSON block below. It restates the locked facts in the format the Module 2/3 verification harness parses. The markdown Evidence Ledger remains the human-readable authority; the sidecar must agree with it exactly. If they disagree, the markdown Ledger wins and the sidecar must be re-emitted.</w:t>
+      </w:r>
+    </w:p>
+    <w:p>
+      <w:pPr>
+        <w:spacing w:before="100" w:beforeAutospacing="1" w:after="100" w:afterAutospacing="1" w:line="240" w:lineRule="auto"/>
+        <w:rPr>
+          <w:rFonts w:ascii="Times New Roman" w:eastAsia="Times New Roman" w:hAnsi="Times New Roman" w:cs="Times New Roman"/>
+          <w:kern w:val="0"/>
+          <w14:ligatures w14:val="none"/>
+        </w:rPr>
+      </w:pPr>
+      <w:r>
+        <w:rPr>
+          <w:rFonts w:ascii="Times New Roman" w:eastAsia="Times New Roman" w:hAnsi="Times New Roman" w:cs="Times New Roman"/>
+          <w:kern w:val="0"/>
+          <w14:ligatures w14:val="none"/>
+        </w:rPr>
+        <w:t>SOURCE PRECEDENCE: If the Q&amp;A Archive in context contains APPENDIX: LOCKED METRICS (CANONICAL), build locked_metrics and qualitative_only by SELECTING the JD-relevant entries from that appendix and copying id, role_id, locked_phrasing, and numeric_tokens VERBATIM. No re-typing from prose, no token edits, no phrasing edits. Set summary_echo per this run’s strategy (it is a per-JD decision, not canonical data). If a selected token appears in the appendix’s collision_token_map, copy that map line into the entry as a note so downstream judgment gates can tell licensed meanings apart. If a metric this JD needs is missing from the appendix, STOP and ask the user, and propose the new entry for the canonical appendix itself rather than this run only, so the fix persists. Only when no canonical appendix exists in context: derive the sidecar from the Evidence Ledger as described below, and print the line SIDECAR DERIVED FROM PROSE (no canonical appendix in context) directly above the JSON block.</w:t>
+      </w:r>
+    </w:p>
+    <w:p>
+      <w:pPr>
+        <w:spacing w:after="0" w:line="240" w:lineRule="auto"/>
+        <w:rPr>
+          <w:rFonts w:ascii="Courier New" w:hAnsi="Courier New" w:cs="Courier New"/>
+          <w:sz w:val="18"/>
+          <w:szCs w:val="18"/>
+        </w:rPr>
+      </w:pPr>
+      <w:r>
+        <w:rPr>
+          <w:rFonts w:ascii="Courier New" w:hAnsi="Courier New" w:cs="Courier New"/>
+          <w:sz w:val="18"/>
+          <w:szCs w:val="18"/>
+        </w:rPr>
+        <w:lastRenderedPageBreak/>
+        <w:t>{</w:t>
+      </w:r>
+    </w:p>
+    <w:p>
+      <w:pPr>
+        <w:spacing w:after="0" w:line="240" w:lineRule="auto"/>
+        <w:rPr>
+          <w:rFonts w:ascii="Courier New" w:hAnsi="Courier New" w:cs="Courier New"/>
+          <w:sz w:val="18"/>
+          <w:szCs w:val="18"/>
+        </w:rPr>
+      </w:pPr>
+      <w:r>
+        <w:rPr>
+          <w:rFonts w:ascii="Courier New" w:hAnsi="Courier New" w:cs="Courier New"/>
+          <w:sz w:val="18"/>
+          <w:szCs w:val="18"/>
+        </w:rPr>
+        <w:t xml:space="preserve">  "jd_title": "&lt;title&gt;",</w:t>
+      </w:r>
+    </w:p>
+    <w:p>
+      <w:pPr>
+        <w:spacing w:after="0" w:line="240" w:lineRule="auto"/>
+        <w:rPr>
+          <w:rFonts w:ascii="Courier New" w:hAnsi="Courier New" w:cs="Courier New"/>
+          <w:sz w:val="18"/>
+          <w:szCs w:val="18"/>
+        </w:rPr>
+      </w:pPr>
+      <w:r>
+        <w:rPr>
+          <w:rFonts w:ascii="Courier New" w:hAnsi="Courier New" w:cs="Courier New"/>
+          <w:sz w:val="18"/>
+          <w:szCs w:val="18"/>
+        </w:rPr>
+        <w:t xml:space="preserve">  "application_type": "CAREER_CHANGE | SAME_FIELD | INTERNAL_TRANSFER",</w:t>
+      </w:r>
+    </w:p>
+    <w:p>
+      <w:pPr>
+        <w:spacing w:after="0" w:line="240" w:lineRule="auto"/>
+        <w:rPr>
+          <w:rFonts w:ascii="Courier New" w:hAnsi="Courier New" w:cs="Courier New"/>
+          <w:sz w:val="18"/>
+          <w:szCs w:val="18"/>
+        </w:rPr>
+      </w:pPr>
+      <w:r>
+        <w:rPr>
+          <w:rFonts w:ascii="Courier New" w:hAnsi="Courier New" w:cs="Courier New"/>
+          <w:sz w:val="18"/>
+          <w:szCs w:val="18"/>
+        </w:rPr>
+        <w:t xml:space="preserve">  "role_level": "ENTRY | MID | SENIOR | EXECUTIVE",</w:t>
+      </w:r>
+    </w:p>
+    <w:p>
+      <w:pPr>
+        <w:spacing w:after="0" w:line="240" w:lineRule="auto"/>
+        <w:rPr>
+          <w:rFonts w:ascii="Courier New" w:hAnsi="Courier New" w:cs="Courier New"/>
+          <w:sz w:val="18"/>
+          <w:szCs w:val="18"/>
+        </w:rPr>
+      </w:pPr>
+      <w:r>
+        <w:rPr>
+          <w:rFonts w:ascii="Courier New" w:hAnsi="Courier New" w:cs="Courier New"/>
+          <w:sz w:val="18"/>
+          <w:szCs w:val="18"/>
+        </w:rPr>
+        <w:t xml:space="preserve">  "top2_roles": ["&lt;RoleID&gt;", "&lt;RoleID&gt;"],</w:t>
+      </w:r>
+    </w:p>
+    <w:p>
+      <w:pPr>
+        <w:spacing w:after="0" w:line="240" w:lineRule="auto"/>
+        <w:rPr>
+          <w:rFonts w:ascii="Courier New" w:hAnsi="Courier New" w:cs="Courier New"/>
+          <w:sz w:val="18"/>
+          <w:szCs w:val="18"/>
+        </w:rPr>
+      </w:pPr>
+      <w:r>
+        <w:rPr>
+          <w:rFonts w:ascii="Courier New" w:hAnsi="Courier New" w:cs="Courier New"/>
+          <w:sz w:val="18"/>
+          <w:szCs w:val="18"/>
+        </w:rPr>
+        <w:t xml:space="preserve">  "roles_original": ["&lt;RoleID&gt;", "&lt;RoleID&gt;", "..."],</w:t>
+      </w:r>
+    </w:p>
+    <w:p>
+      <w:pPr>
+        <w:spacing w:after="0" w:line="240" w:lineRule="auto"/>
+        <w:rPr>
+          <w:rFonts w:ascii="Courier New" w:hAnsi="Courier New" w:cs="Courier New"/>
+          <w:sz w:val="18"/>
+          <w:szCs w:val="18"/>
+        </w:rPr>
+      </w:pPr>
+      <w:r>
+        <w:rPr>
+          <w:rFonts w:ascii="Courier New" w:hAnsi="Courier New" w:cs="Courier New"/>
+          <w:sz w:val="18"/>
+          <w:szCs w:val="18"/>
+        </w:rPr>
+        <w:t xml:space="preserve">  "locked_metrics": [</w:t>
+      </w:r>
+    </w:p>
+    <w:p>
+      <w:pPr>
+        <w:spacing w:after="0" w:line="240" w:lineRule="auto"/>
+        <w:rPr>
+          <w:rFonts w:ascii="Courier New" w:hAnsi="Courier New" w:cs="Courier New"/>
+          <w:sz w:val="18"/>
+          <w:szCs w:val="18"/>
+        </w:rPr>
+      </w:pPr>
+      <w:r>
+        <w:rPr>
+          <w:rFonts w:ascii="Courier New" w:hAnsi="Courier New" w:cs="Courier New"/>
+          <w:sz w:val="18"/>
+          <w:szCs w:val="18"/>
+        </w:rPr>
+        <w:t xml:space="preserve">    {"id": "M1",</w:t>
+      </w:r>
+    </w:p>
+    <w:p>
+      <w:pPr>
+        <w:spacing w:after="0" w:line="240" w:lineRule="auto"/>
+        <w:rPr>
+          <w:rFonts w:ascii="Courier New" w:hAnsi="Courier New" w:cs="Courier New"/>
+          <w:sz w:val="18"/>
+          <w:szCs w:val="18"/>
+        </w:rPr>
+      </w:pPr>
+      <w:r>
+        <w:rPr>
+          <w:rFonts w:ascii="Courier New" w:hAnsi="Courier New" w:cs="Courier New"/>
+          <w:sz w:val="18"/>
+          <w:szCs w:val="18"/>
+        </w:rPr>
+        <w:t xml:space="preserve">     "locked_phrasing": "&lt;the exact permissible phrasing&gt;",</w:t>
+      </w:r>
+    </w:p>
+    <w:p>
+      <w:pPr>
+        <w:spacing w:after="0" w:line="240" w:lineRule="auto"/>
+        <w:rPr>
+          <w:rFonts w:ascii="Courier New" w:hAnsi="Courier New" w:cs="Courier New"/>
+          <w:sz w:val="18"/>
+          <w:szCs w:val="18"/>
+        </w:rPr>
+      </w:pPr>
+      <w:r>
+        <w:rPr>
+          <w:rFonts w:ascii="Courier New" w:hAnsi="Courier New" w:cs="Courier New"/>
+          <w:sz w:val="18"/>
+          <w:szCs w:val="18"/>
+        </w:rPr>
+        <w:t xml:space="preserve">     "numeric_tokens": ["&lt;every numeric or word-number token the phrasing licenses&gt;"],</w:t>
+      </w:r>
+    </w:p>
+    <w:p>
+      <w:pPr>
+        <w:spacing w:after="0" w:line="240" w:lineRule="auto"/>
+        <w:rPr>
+          <w:rFonts w:ascii="Courier New" w:hAnsi="Courier New" w:cs="Courier New"/>
+          <w:sz w:val="18"/>
+          <w:szCs w:val="18"/>
+        </w:rPr>
+      </w:pPr>
+      <w:r>
+        <w:rPr>
+          <w:rFonts w:ascii="Courier New" w:hAnsi="Courier New" w:cs="Courier New"/>
+          <w:sz w:val="18"/>
+          <w:szCs w:val="18"/>
+        </w:rPr>
+        <w:t xml:space="preserve">     "role_id": "&lt;RoleID this metric binds to&gt;",</w:t>
+      </w:r>
+    </w:p>
+    <w:p>
+      <w:pPr>
+        <w:spacing w:after="0" w:line="240" w:lineRule="auto"/>
+        <w:rPr>
+          <w:rFonts w:ascii="Courier New" w:hAnsi="Courier New" w:cs="Courier New"/>
+          <w:sz w:val="18"/>
+          <w:szCs w:val="18"/>
+        </w:rPr>
+      </w:pPr>
+      <w:r>
+        <w:rPr>
+          <w:rFonts w:ascii="Courier New" w:hAnsi="Courier New" w:cs="Courier New"/>
+          <w:sz w:val="18"/>
+          <w:szCs w:val="18"/>
+        </w:rPr>
+        <w:t xml:space="preserve">     "summary_echo": true}</w:t>
+      </w:r>
+    </w:p>
+    <w:p>
+      <w:pPr>
+        <w:spacing w:after="0" w:line="240" w:lineRule="auto"/>
+        <w:rPr>
+          <w:rFonts w:ascii="Courier New" w:hAnsi="Courier New" w:cs="Courier New"/>
+          <w:sz w:val="18"/>
+          <w:szCs w:val="18"/>
+        </w:rPr>
+      </w:pPr>
+      <w:r>
+        <w:rPr>
+          <w:rFonts w:ascii="Courier New" w:hAnsi="Courier New" w:cs="Courier New"/>
+          <w:sz w:val="18"/>
+          <w:szCs w:val="18"/>
+        </w:rPr>
+        <w:t xml:space="preserve">  ],</w:t>
+      </w:r>
+    </w:p>
+    <w:p>
+      <w:pPr>
+        <w:spacing w:after="0" w:line="240" w:lineRule="auto"/>
+        <w:rPr>
+          <w:rFonts w:ascii="Courier New" w:hAnsi="Courier New" w:cs="Courier New"/>
+          <w:sz w:val="18"/>
+          <w:szCs w:val="18"/>
+        </w:rPr>
+      </w:pPr>
+      <w:r>
+        <w:rPr>
+          <w:rFonts w:ascii="Courier New" w:hAnsi="Courier New" w:cs="Courier New"/>
+          <w:sz w:val="18"/>
+          <w:szCs w:val="18"/>
+        </w:rPr>
+        <w:t xml:space="preserve">  "qualitative_only": [</w:t>
+      </w:r>
+    </w:p>
+    <w:p>
+      <w:pPr>
+        <w:spacing w:after="0" w:line="240" w:lineRule="auto"/>
+        <w:rPr>
+          <w:rFonts w:ascii="Courier New" w:hAnsi="Courier New" w:cs="Courier New"/>
+          <w:sz w:val="18"/>
+          <w:szCs w:val="18"/>
+        </w:rPr>
+      </w:pPr>
+      <w:r>
+        <w:rPr>
+          <w:rFonts w:ascii="Courier New" w:hAnsi="Courier New" w:cs="Courier New"/>
+          <w:sz w:val="18"/>
+          <w:szCs w:val="18"/>
+        </w:rPr>
+        <w:t xml:space="preserve">    {"id": "Q1",</w:t>
+      </w:r>
+    </w:p>
+    <w:p>
+      <w:pPr>
+        <w:spacing w:after="0" w:line="240" w:lineRule="auto"/>
+        <w:rPr>
+          <w:rFonts w:ascii="Courier New" w:hAnsi="Courier New" w:cs="Courier New"/>
+          <w:sz w:val="18"/>
+          <w:szCs w:val="18"/>
+        </w:rPr>
+      </w:pPr>
+      <w:r>
+        <w:rPr>
+          <w:rFonts w:ascii="Courier New" w:hAnsi="Courier New" w:cs="Courier New"/>
+          <w:sz w:val="18"/>
+          <w:szCs w:val="18"/>
+        </w:rPr>
+        <w:t xml:space="preserve">     "topic": "&lt;what was observed&gt;",</w:t>
+      </w:r>
+    </w:p>
+    <w:p>
+      <w:pPr>
+        <w:spacing w:after="0" w:line="240" w:lineRule="auto"/>
+        <w:rPr>
+          <w:rFonts w:ascii="Courier New" w:hAnsi="Courier New" w:cs="Courier New"/>
+          <w:sz w:val="18"/>
+          <w:szCs w:val="18"/>
+        </w:rPr>
+      </w:pPr>
+      <w:r>
+        <w:rPr>
+          <w:rFonts w:ascii="Courier New" w:hAnsi="Courier New" w:cs="Courier New"/>
+          <w:sz w:val="18"/>
+          <w:szCs w:val="18"/>
+        </w:rPr>
+        <w:t xml:space="preserve">     "banned_tokens": ["&lt;numbers that must NEVER appear for this item&gt;"]}</w:t>
+      </w:r>
+    </w:p>
+    <w:p>
+      <w:pPr>
+        <w:spacing w:after="0" w:line="240" w:lineRule="auto"/>
+        <w:rPr>
+          <w:rFonts w:ascii="Courier New" w:hAnsi="Courier New" w:cs="Courier New"/>
+          <w:sz w:val="18"/>
+          <w:szCs w:val="18"/>
+        </w:rPr>
+      </w:pPr>
+      <w:r>
+        <w:rPr>
+          <w:rFonts w:ascii="Courier New" w:hAnsi="Courier New" w:cs="Courier New"/>
+          <w:sz w:val="18"/>
+          <w:szCs w:val="18"/>
+        </w:rPr>
+        <w:t xml:space="preserve">  ]</w:t>
+      </w:r>
+    </w:p>
+    <w:p>
+      <w:pPr>
+        <w:spacing w:after="0" w:line="240" w:lineRule="auto"/>
+        <w:rPr>
+          <w:rFonts w:ascii="Courier New" w:hAnsi="Courier New" w:cs="Courier New"/>
+          <w:sz w:val="18"/>
+          <w:szCs w:val="18"/>
+        </w:rPr>
+      </w:pPr>
+      <w:r>
+        <w:rPr>
+          <w:rFonts w:ascii="Courier New" w:hAnsi="Courier New" w:cs="Courier New"/>
+          <w:sz w:val="18"/>
+          <w:szCs w:val="18"/>
+        </w:rPr>
+        <w:t>}</w:t>
+      </w:r>
+    </w:p>
+    <w:p>
+      <w:pPr>
+        <w:spacing w:before="100" w:beforeAutospacing="1" w:after="100" w:afterAutospacing="1" w:line="240" w:lineRule="auto"/>
+        <w:rPr>
+          <w:rFonts w:ascii="Times New Roman" w:eastAsia="Times New Roman" w:hAnsi="Times New Roman" w:cs="Times New Roman"/>
+          <w:kern w:val="0"/>
+          <w14:ligatures w14:val="none"/>
+        </w:rPr>
+      </w:pPr>
+      <w:r>
+        <w:rPr>
+          <w:rFonts w:ascii="Times New Roman" w:eastAsia="Times New Roman" w:hAnsi="Times New Roman" w:cs="Times New Roman"/>
+          <w:kern w:val="0"/>
+          <w14:ligatures w14:val="none"/>
+        </w:rPr>
+        <w:t>RULES: numeric_tokens lists every token exactly as it may appear on the resume, including signs (40%, 15+, 53,000, five). A phrasing with two numbers (reduced 30 hours to 18 hours weekly) lists both (30 and 18). qualitative_only entries carry the numbers the Q&amp;A Archive mentioned observationally; the harness blocks these tokens on sight, which mechanically enforces the QUALITATIVE ONLY rule and Metric Promotion Pattern 1.</w:t>
+      </w:r>
+    </w:p>
+    <w:p>
+      <w:pPr>
+        <w:spacing w:before="100" w:beforeAutospacing="1" w:after="100" w:afterAutospacing="1" w:line="240" w:lineRule="auto"/>
+        <w:rPr>
+          <w:rFonts w:ascii="Times New Roman" w:eastAsia="Times New Roman" w:hAnsi="Times New Roman" w:cs="Times New Roman"/>
+          <w:kern w:val="0"/>
+          <w14:ligatures w14:val="none"/>
+        </w:rPr>
+      </w:pPr>
+      <w:r>
+        <w:rPr>
+          <w:rFonts w:ascii="Times New Roman" w:eastAsia="Times New Roman" w:hAnsi="Times New Roman" w:cs="Times New Roman"/>
+          <w:kern w:val="0"/>
+          <w14:ligatures w14:val="none"/>
+        </w:rPr>
+        <w:t>Module 2 appends one key to this data before Harness Run A: exact_phrases, the exact JD phrases targeted in that draft. Phrase targeting is a Module 2 decision, not a Module 1 fact.</w:t>
       </w:r>
     </w:p>
     <w:p>
@@ -41035,7 +41495,7 @@
         </w:rPr>
       </w:pPr>
       <w:r>
-        <w:pict w14:anchorId="36C1DB63">
+        <w:pict w14:anchorId="5F84AE0C">
           <v:rect id="Horizontal Line 42" o:spid="_x0000_s1027" alt="" style="width:468pt;height:.05pt;visibility:visible;mso-wrap-style:square;mso-width-percent:0;mso-height-percent:0;mso-left-percent:-10001;mso-top-percent:-10001;mso-position-horizontal:absolute;mso-position-horizontal-relative:char;mso-position-vertical:absolute;mso-position-vertical-relative:line;mso-width-percent:0;mso-height-percent:0;mso-left-percent:-10001;mso-top-percent:-10001;v-text-anchor:top" filled="f">
             <o:lock v:ext="edit" rotation="t" aspectratio="t" verticies="t" text="t" shapetype="t"/>
             <w10:anchorlock/>
@@ -41203,7 +41663,7 @@
         </w:rPr>
       </w:pPr>
       <w:r>
-        <w:pict w14:anchorId="3CE17E51">
+        <w:pict w14:anchorId="6DFA601E">
           <v:rect id="Horizontal Line 43" o:spid="_x0000_s1026" alt="" style="width:468pt;height:.05pt;visibility:visible;mso-wrap-style:square;mso-width-percent:0;mso-height-percent:0;mso-left-percent:-10001;mso-top-percent:-10001;mso-position-horizontal:absolute;mso-position-horizontal-relative:char;mso-position-vertical:absolute;mso-position-vertical-relative:line;mso-width-percent:0;mso-height-percent:0;mso-left-percent:-10001;mso-top-percent:-10001;v-text-anchor:top" filled="f">
             <o:lock v:ext="edit" rotation="t" aspectratio="t" verticies="t" text="t" shapetype="t"/>
             <w10:anchorlock/>
@@ -41223,7 +41683,7 @@
 </file>
 
 <file path=word/numbering.xml><?xml version="1.0" encoding="utf-8"?>
-<w:numbering xmlns:wpc="http://schemas.microsoft.com/office/word/2010/wordprocessingCanvas" xmlns:cx="http://schemas.microsoft.com/office/drawing/2014/chartex" xmlns:cx1="http://schemas.microsoft.com/office/drawing/2015/9/8/chartex" xmlns:cx2="http://schemas.microsoft.com/office/drawing/2015/10/21/chartex" xmlns:cx3="http://schemas.microsoft.com/office/drawing/2016/5/9/chartex" xmlns:cx4="http://schemas.microsoft.com/office/drawing/2016/5/10/chartex" xmlns:cx5="http://schemas.microsoft.com/office/drawing/2016/5/11/chartex" xmlns:cx6="http://schemas.microsoft.com/office/drawing/2016/5/12/chartex" xmlns:cx7="http://schemas.microsoft.com/office/drawing/2016/5/13/chartex" xmlns:cx8="http://schemas.microsoft.com/office/drawing/2016/5/14/chartex" xmlns:mc="http://schemas.openxmlformats.org/markup-compatibility/2006" xmlns:aink="http://schemas.microsoft.com/office/drawing/2016/ink" xmlns:am3d="http://schemas.microsoft.com/office/drawing/2017/model3d" xmlns:o="urn:schemas-microsoft-com:office:office" xmlns:oel="http://schemas.microsoft.com/office/2019/extlst" xmlns:r="http://schemas.openxmlformats.org/officeDocument/2006/relationships" xmlns:m="http://schemas.openxmlformats.org/officeDocument/2006/math" xmlns:v="urn:schemas-microsoft-com:vml" xmlns:wp14="http://schemas.microsoft.com/office/word/2010/wordprocessingDrawing" xmlns:wp="http://schemas.openxmlformats.org/drawingml/2006/wordprocessingDrawing" xmlns:w10="urn:schemas-microsoft-com:office:word" xmlns:w="http://schemas.openxmlformats.org/wordprocessingml/2006/main" xmlns:w14="http://schemas.microsoft.com/office/word/2010/wordml" xmlns:w15="http://schemas.microsoft.com/office/word/2012/wordml" xmlns:w16cex="http://schemas.microsoft.com/office/word/2018/wordml/cex" xmlns:w16cid="http://schemas.microsoft.com/office/word/2016/wordml/cid" xmlns:w16="http://schemas.microsoft.com/office/word/2018/wordml" xmlns:w16du="http://schemas.microsoft.com/office/word/2023/wordml/word16du" xmlns:w16sdtdh="http://schemas.microsoft.com/office/word/2020/wordml/sdtdatahash" xmlns:w16sdtfl="http://schemas.microsoft.com/office/word/2024/wordml/sdtformatlock" xmlns:w16se="http://schemas.microsoft.com/office/word/2015/wordml/symex" xmlns:wpg="http://schemas.microsoft.com/office/word/2010/wordprocessingGroup" xmlns:wpi="http://schemas.microsoft.com/office/word/2010/wordprocessingInk" xmlns:wne="http://schemas.microsoft.com/office/word/2006/wordml" xmlns:wps="http://schemas.microsoft.com/office/word/2010/wordprocessingShape" mc:Ignorable="w14 w15 w16se w16cid w16 w16cex w16sdtdh w16sdtfl w16du wp14">
+<w:numbering xmlns:wpc="http://schemas.microsoft.com/office/word/2010/wordprocessingCanvas" xmlns:cx="http://schemas.microsoft.com/office/drawing/2014/chartex" xmlns:cx1="http://schemas.microsoft.com/office/drawing/2015/9/8/chartex" xmlns:cx2="http://schemas.microsoft.com/office/drawing/2015/10/21/chartex" xmlns:cx3="http://schemas.microsoft.com/office/drawing/2016/5/9/chartex" xmlns:cx4="http://schemas.microsoft.com/office/drawing/2016/5/10/chartex" xmlns:cx5="http://schemas.microsoft.com/office/drawing/2016/5/11/chartex" xmlns:cx6="http://schemas.microsoft.com/office/drawing/2016/5/12/chartex" xmlns:cx7="http://schemas.microsoft.com/office/drawing/2016/5/13/chartex" xmlns:cx8="http://schemas.microsoft.com/office/drawing/2016/5/14/chartex" xmlns:mc="http://schemas.openxmlformats.org/markup-compatibility/2006" xmlns:m="http://schemas.openxmlformats.org/officeDocument/2006/math" xmlns:aink="http://schemas.microsoft.com/office/drawing/2016/ink" xmlns:am3d="http://schemas.microsoft.com/office/drawing/2017/model3d" xmlns:oel="http://schemas.microsoft.com/office/2019/extlst" xmlns:r="http://schemas.openxmlformats.org/officeDocument/2006/relationships" xmlns:wp14="http://schemas.microsoft.com/office/word/2010/wordprocessingDrawing" xmlns:wp="http://schemas.openxmlformats.org/drawingml/2006/wordprocessingDrawing" xmlns:wpg="http://schemas.microsoft.com/office/word/2010/wordprocessingGroup" xmlns:wpi="http://schemas.microsoft.com/office/word/2010/wordprocessingInk" xmlns:wps="http://schemas.microsoft.com/office/word/2010/wordprocessingShape" xmlns:o="urn:schemas-microsoft-com:office:office" xmlns:v="urn:schemas-microsoft-com:vml" xmlns:w10="urn:schemas-microsoft-com:office:word" xmlns:w="http://schemas.openxmlformats.org/wordprocessingml/2006/main" xmlns:w14="http://schemas.microsoft.com/office/word/2010/wordml" xmlns:w15="http://schemas.microsoft.com/office/word/2012/wordml" xmlns:w16cex="http://schemas.microsoft.com/office/word/2018/wordml/cex" xmlns:w16cid="http://schemas.microsoft.com/office/word/2016/wordml/cid" xmlns:w16="http://schemas.microsoft.com/office/word/2018/wordml" xmlns:w16sdtdh="http://schemas.microsoft.com/office/word/2020/wordml/sdtdatahash" xmlns:w16sdtfl="http://schemas.microsoft.com/office/word/2024/wordml/sdtformatlock" xmlns:w16se="http://schemas.microsoft.com/office/word/2015/wordml/symex" xmlns:w16du="http://schemas.microsoft.com/office/word/2023/wordml/word16du" xmlns:wne="http://schemas.microsoft.com/office/word/2006/wordml" mc:Ignorable="w14 w15 w16se w16cid w16 w16cex w16sdtdh w16sdtfl w16du wp14">
   <w:abstractNum w:abstractNumId="0" w15:restartNumberingAfterBreak="0">
     <w:nsid w:val="03186B70"/>
     <w:multiLevelType w:val="multilevel"/>
@@ -51081,7 +51541,7 @@
 </file>
 
 <file path=word/styles.xml><?xml version="1.0" encoding="utf-8"?>
-<w:styles xmlns:mc="http://schemas.openxmlformats.org/markup-compatibility/2006" xmlns:r="http://schemas.openxmlformats.org/officeDocument/2006/relationships" xmlns:w="http://schemas.openxmlformats.org/wordprocessingml/2006/main" xmlns:w14="http://schemas.microsoft.com/office/word/2010/wordml" xmlns:w15="http://schemas.microsoft.com/office/word/2012/wordml" xmlns:w16cex="http://schemas.microsoft.com/office/word/2018/wordml/cex" xmlns:w16cid="http://schemas.microsoft.com/office/word/2016/wordml/cid" xmlns:w16="http://schemas.microsoft.com/office/word/2018/wordml" xmlns:w16du="http://schemas.microsoft.com/office/word/2023/wordml/word16du" xmlns:w16sdtdh="http://schemas.microsoft.com/office/word/2020/wordml/sdtdatahash" xmlns:w16sdtfl="http://schemas.microsoft.com/office/word/2024/wordml/sdtformatlock" xmlns:w16se="http://schemas.microsoft.com/office/word/2015/wordml/symex" mc:Ignorable="w14 w15 w16se w16cid w16 w16cex w16sdtdh w16sdtfl w16du">
+<w:styles xmlns:mc="http://schemas.openxmlformats.org/markup-compatibility/2006" xmlns:r="http://schemas.openxmlformats.org/officeDocument/2006/relationships" xmlns:w="http://schemas.openxmlformats.org/wordprocessingml/2006/main" xmlns:w14="http://schemas.microsoft.com/office/word/2010/wordml" xmlns:w15="http://schemas.microsoft.com/office/word/2012/wordml" xmlns:w16cex="http://schemas.microsoft.com/office/word/2018/wordml/cex" xmlns:w16cid="http://schemas.microsoft.com/office/word/2016/wordml/cid" xmlns:w16="http://schemas.microsoft.com/office/word/2018/wordml" xmlns:w16sdtdh="http://schemas.microsoft.com/office/word/2020/wordml/sdtdatahash" xmlns:w16sdtfl="http://schemas.microsoft.com/office/word/2024/wordml/sdtformatlock" xmlns:w16se="http://schemas.microsoft.com/office/word/2015/wordml/symex" xmlns:w16du="http://schemas.microsoft.com/office/word/2023/wordml/word16du" mc:Ignorable="w14 w15 w16se w16cid w16 w16cex w16sdtdh w16sdtfl w16du">
   <w:docDefaults>
     <w:rPrDefault>
       <w:rPr>

</xml_diff>